<commit_message>
Reword summary so it does not depend on operational data the student lacks
The model is now built from the literature and practitioners' experience
and validated by expert review. Removed the real case-study commitment,
replaced data-pattern wording with recurring operational problems, and
softened the literature-gap claim.

Co-Authored-By: Claude Opus 5.5 <noreply@anthropic.com>
Claude-Session: https://claude.ai/code/session_01Nx6foxEiSvCdRQd3zZ6Gj4
</commit_message>
<xml_diff>
--- a/research-proposal-summary.docx
+++ b/research-proposal-summary.docx
@@ -65,7 +65,7 @@
           <w:color w:val="000000"/>
           <w:rtl/>
         </w:rPr>
-        <w:t xml:space="preserve">تصمم المباني على افتراضات عن المستخدمين وأنماط الاستخدام والظروف الداخلية، وبعد الإشغال تجمع إدارة المرافق بيانات تثبتها أو تنقضها، مثل البلاغات واستخدام الفراغات واستهلاك الطاقة وشكاوى المستخدمين. لكن هذه البيانات تجمع لخدمة التشغيل، ولا تعود إلى المصممين بشكل منهجي، فتتكرر الأخطاء نفسها في المشاريع اللاحقة. ولا تظهر في الممارسة المحلية آلية تحدد أي البيانات تحمل دلالة تصميمية، ومن يحللها، وكيف تتحول إلى متطلبات تصميمية.</w:t>
+        <w:t xml:space="preserve">تصمم المباني على افتراضات عن المستخدمين وأنماط الاستخدام والظروف الداخلية، وبعد الإشغال تجمع إدارة المرافق بيانات تثبتها أو تنقضها، مثل البلاغات واستخدام الفراغات واستهلاك الطاقة وشكاوى المستخدمين. لكن هذه البيانات تجمع لخدمة التشغيل، ولا تعود إلى المصممين بشكل منهجي، فتتكرر الأخطاء نفسها في المشاريع اللاحقة. ولا تظهر في الممارسة المحلية آلية تحدد أي البيانات تحمل دلالة تصميمية، ومن يحللها، وكيف تصبح متطلبات تصميمية.</w:t>
       </w:r>
     </w:p>
     <w:p>
@@ -79,7 +79,7 @@
           <w:color w:val="000000"/>
           <w:rtl/>
         </w:rPr>
-        <w:t xml:space="preserve">ومن مظاهر المشكلة ضياع دروس التشغيل مع تغير الكوادر، واختلاف لغة المشغل عن لغة المصمم، وانفصالهما في عقدين مستقلين، واقتصار تقييم ما بعد الإشغال على المبنى الواحد، وانتقال الخطأ إلى كل نسخة من النماذج المتكررة. وتؤكد الأدبيات ضرورة التغذية الراجعة من التشغيل إلى التصميم، لكنها لا تقدم آلية منهجية تحول بيانات التشغيل المستمرة إلى معرفة تصميمية.</w:t>
+        <w:t xml:space="preserve">ومن مظاهر المشكلة ضياع دروس التشغيل مع تغير الكوادر، واختلاف لغة المشغل عن لغة المصمم، وانفصالهما في عقدين مستقلين، واقتصار تقييم ما بعد الإشغال على المبنى الواحد، وانتقال الخطأ إلى كل نسخة من النماذج المتكررة. وتؤكد الأدبيات ضرورة نقل دروس التشغيل إلى التصميم، لكنها تعتمد في ذلك غالبًا على تقييمات دورية أو إشراك فرق التشغيل، ولا تظهر فيها آلية واضحة تحول بيانات التشغيل المستمرة إلى معرفة تصميمية، خاصة في المملكة.</w:t>
       </w:r>
     </w:p>
     <w:p>
@@ -168,7 +168,7 @@
           <w:color w:val="000000"/>
           <w:rtl/>
         </w:rPr>
-        <w:t xml:space="preserve">كيف تتبادل إدارة المرافق والمكاتب الهندسية المعرفة في المملكة، وما معوقاتها؟</w:t>
+        <w:t xml:space="preserve">كيف تتبادل إدارة المرافق والمكاتب الهندسية المعرفة في المملكة، وما معوقات ذلك؟</w:t>
       </w:r>
     </w:p>
     <w:p>
@@ -191,7 +191,7 @@
           <w:color w:val="000000"/>
           <w:rtl/>
         </w:rPr>
-        <w:t xml:space="preserve">كيف ترتبط أنماط بيانات التشغيل بقرارات تصميمية محددة؟</w:t>
+        <w:t xml:space="preserve">كيف ترتبط المشكلات التشغيلية المتكررة بقرارات تصميمية محددة؟</w:t>
       </w:r>
     </w:p>
     <w:p>
@@ -280,7 +280,7 @@
           <w:color w:val="000000"/>
           <w:rtl/>
         </w:rPr>
-        <w:t xml:space="preserve">تطوير نموذج للتغذية الراجعة يحول بيانات تشغيل المرافق إلى معرفة تصميمية، والتحقق من صلاحيته في المباني الجامعية بالمملكة.</w:t>
+        <w:t xml:space="preserve">تطوير نموذج للتغذية الراجعة، من الأدبيات وخبرة الممارسين، يحول بيانات تشغيل المرافق إلى معرفة تصميمية، والتحقق منه في السياق السعودي.</w:t>
       </w:r>
     </w:p>
     <w:p>
@@ -349,7 +349,7 @@
           <w:color w:val="000000"/>
           <w:rtl/>
         </w:rPr>
-        <w:t xml:space="preserve">بناء مصفوفة تربط أنماط بيانات التشغيل بقرارات تصميمية محددة.</w:t>
+        <w:t xml:space="preserve">بناء مصفوفة تربط المشكلات التشغيلية المتكررة بقرارات تصميمية محددة.</w:t>
       </w:r>
     </w:p>
     <w:p>
@@ -395,7 +395,7 @@
           <w:color w:val="000000"/>
           <w:rtl/>
         </w:rPr>
-        <w:t xml:space="preserve">التحقق من صلاحية النموذج وقابليته للتطبيق عبر الخبراء وحالة دراسية فعلية.</w:t>
+        <w:t xml:space="preserve">التحقق من صلاحية النموذج وقابليته للتطبيق عبر تحكيم الخبراء.</w:t>
       </w:r>
     </w:p>
     <w:sectPr>

</xml_diff>

<commit_message>
Ground the research summary in its philosophical framing
Frames the problem epistemically (Popper's conjecture and refutation,
Argyris and Schon's double-loop learning), positions the gap against
Hillier et al.'s conjecture-analysis view of design, and adds a
theoretical question and objective. Still one page and still free of
any dependence on operational datasets.

Co-Authored-By: Claude Opus 5.5 <noreply@anthropic.com>
Claude-Session: https://claude.ai/code/session_01Nx6foxEiSvCdRQd3zZ6Gj4
</commit_message>
<xml_diff>
--- a/research-proposal-summary.docx
+++ b/research-proposal-summary.docx
@@ -65,7 +65,7 @@
           <w:color w:val="000000"/>
           <w:rtl/>
         </w:rPr>
-        <w:t xml:space="preserve">تصمم المباني على افتراضات عن المستخدمين وأنماط الاستخدام والظروف الداخلية، وبعد الإشغال تجمع إدارة المرافق بيانات تثبتها أو تنقضها، مثل البلاغات واستخدام الفراغات واستهلاك الطاقة وشكاوى المستخدمين. لكن هذه البيانات تجمع لخدمة التشغيل، ولا تعود إلى المصممين بشكل منهجي، فتتكرر الأخطاء نفسها في المشاريع اللاحقة. ولا تظهر في الممارسة المحلية آلية تحدد أي البيانات تحمل دلالة تصميمية، ومن يحللها، وكيف تصبح متطلبات تصميمية.</w:t>
+        <w:t xml:space="preserve">تصمم المباني على افتراضات عن المستخدمين وأنماط الاستخدام والظروف الداخلية، وتجمع إدارة المرافق بعد الإشغال بيانات تثبتها أو تنقضها، كالبلاغات واستهلاك الطاقة، لكنها لا تعود إلى المصممين بشكل منهجي، فتتكرر الأخطاء في المشاريع اللاحقة والنماذج المتكررة. والمشكلة في عمقها معرفية: فالمعرفة عند بوبر تنمو بالتخمين ومحاولة الدحض، وقرار التصميم تخمين والإشغال اختباره، فإذا لم تعد نتائجه إلى المصمم بقي تخمينه بلا اختبار، وغابت عنه النواتج غير المقصودة لقراراته.</w:t>
       </w:r>
     </w:p>
     <w:p>
@@ -79,7 +79,7 @@
           <w:color w:val="000000"/>
           <w:rtl/>
         </w:rPr>
-        <w:t xml:space="preserve">ومن مظاهر المشكلة ضياع دروس التشغيل مع تغير الكوادر، واختلاف لغة المشغل عن لغة المصمم، وانفصالهما في عقدين مستقلين، واقتصار تقييم ما بعد الإشغال على المبنى الواحد، وانتقال الخطأ إلى كل نسخة من النماذج المتكررة. وتؤكد الأدبيات ضرورة نقل دروس التشغيل إلى التصميم، لكنها تعتمد في ذلك غالبًا على تقييمات دورية أو إشراك فرق التشغيل، ولا تظهر فيها آلية واضحة تحول بيانات التشغيل المستمرة إلى معرفة تصميمية، خاصة في المملكة.</w:t>
+        <w:t xml:space="preserve">ويقف التعلم غالبًا عند حلقة أحادية تصلح العطل في المبنى القائم، دون حلقة مزدوجة تراجع افتراضات التصميم نفسها (أرجيريس وشون). وقد وظف هيلير وآخرون منطق التخمين والدحض داخل عملية التصميم، لكن لا يظهر إطار نظري وآلية مؤسسية تمدانه إلى مرحلة الإشغال، خاصة في المملكة.</w:t>
       </w:r>
     </w:p>
     <w:p>
@@ -122,7 +122,7 @@
           <w:color w:val="000000"/>
           <w:rtl/>
         </w:rPr>
-        <w:t xml:space="preserve">كيف يمكن تحويل بيانات تشغيل المرافق إلى معرفة تصميمية تستخدم بشكل منهجي في المشاريع المعمارية اللاحقة؟</w:t>
+        <w:t xml:space="preserve">كيف تصبح بيانات تشغيل المرافق اختبارًا منتظمًا لافتراضات التصميم، تنمو به المعرفة المعمارية من مشروع إلى آخر؟</w:t>
       </w:r>
     </w:p>
     <w:p>
@@ -145,7 +145,7 @@
           <w:color w:val="000000"/>
           <w:rtl/>
         </w:rPr>
-        <w:t xml:space="preserve">ما أنواع بيانات التشغيل التي تحمل دلالة تصميمية، وما درجة موثوقيتها؟</w:t>
+        <w:t xml:space="preserve">ما الطبيعة المعرفية لقرار التصميم، وإلى أي حد يعززه التشغيل أو يدحضه؟</w:t>
       </w:r>
     </w:p>
     <w:p>
@@ -168,7 +168,7 @@
           <w:color w:val="000000"/>
           <w:rtl/>
         </w:rPr>
-        <w:t xml:space="preserve">كيف تتبادل إدارة المرافق والمكاتب الهندسية المعرفة في المملكة، وما معوقات ذلك؟</w:t>
+        <w:t xml:space="preserve">ما بيانات التشغيل التي تصلح شاهدًا على افتراضات التصميم، وما موثوقيتها؟</w:t>
       </w:r>
     </w:p>
     <w:p>
@@ -191,7 +191,7 @@
           <w:color w:val="000000"/>
           <w:rtl/>
         </w:rPr>
-        <w:t xml:space="preserve">كيف ترتبط المشكلات التشغيلية المتكررة بقرارات تصميمية محددة؟</w:t>
+        <w:t xml:space="preserve">كيف تنتقل المعرفة بين إدارة المرافق والمصممين في المملكة، وإلى أي حد تراجع افتراضات التصميم؟</w:t>
       </w:r>
     </w:p>
     <w:p>
@@ -214,7 +214,7 @@
           <w:color w:val="000000"/>
           <w:rtl/>
         </w:rPr>
-        <w:t xml:space="preserve">ما مكونات نموذج التغذية الراجعة الملائم للسياق السعودي؟</w:t>
+        <w:t xml:space="preserve">كيف ترتبط المشكلات التشغيلية المتكررة بافتراضات التصميم وقراراته؟</w:t>
       </w:r>
     </w:p>
     <w:p>
@@ -237,7 +237,7 @@
           <w:color w:val="000000"/>
           <w:rtl/>
         </w:rPr>
-        <w:t xml:space="preserve">ما مدى صلاحية النموذج وقابليته للتطبيق؟</w:t>
+        <w:t xml:space="preserve">ما مكونات نموذج للتغذية الراجعة يحقق التعلم مزدوج الحلقة، وما صلاحيته؟</w:t>
       </w:r>
     </w:p>
     <w:p>
@@ -280,7 +280,7 @@
           <w:color w:val="000000"/>
           <w:rtl/>
         </w:rPr>
-        <w:t xml:space="preserve">تطوير نموذج للتغذية الراجعة، من الأدبيات وخبرة الممارسين، يحول بيانات تشغيل المرافق إلى معرفة تصميمية، والتحقق منه في السياق السعودي.</w:t>
+        <w:t xml:space="preserve">بناء إطار نظري ونموذج، من الأدبيات والممارسين، يجعلان بيانات التشغيل اختبارًا منتظمًا لافتراضات التصميم، والتحقق منهما في المملكة.</w:t>
       </w:r>
     </w:p>
     <w:p>
@@ -303,7 +303,7 @@
           <w:color w:val="000000"/>
           <w:rtl/>
         </w:rPr>
-        <w:t xml:space="preserve">تحديد بيانات التشغيل ذات الدلالة التصميمية، وتصنيفها حسب مصدرها وموثوقيتها.</w:t>
+        <w:t xml:space="preserve">تأصيل قرار التصميم بوصفه فرضية قابلة للدحض، وبناء إطار نظري للتغذية الراجعة في ضوء فلسفة بوبر والتعلم مزدوج الحلقة.</w:t>
       </w:r>
     </w:p>
     <w:p>
@@ -326,7 +326,7 @@
           <w:color w:val="000000"/>
           <w:rtl/>
         </w:rPr>
-        <w:t xml:space="preserve">تشخيص ممارسة تبادل المعرفة بين إدارة المرافق والتصميم في المملكة، ومعوقاتها وممكناتها.</w:t>
+        <w:t xml:space="preserve">تحديد بيانات التشغيل الصالحة شاهدًا على افتراضات التصميم، وتصنيفها حسب مصدرها وموثوقيتها.</w:t>
       </w:r>
     </w:p>
     <w:p>
@@ -349,7 +349,7 @@
           <w:color w:val="000000"/>
           <w:rtl/>
         </w:rPr>
-        <w:t xml:space="preserve">بناء مصفوفة تربط المشكلات التشغيلية المتكررة بقرارات تصميمية محددة.</w:t>
+        <w:t xml:space="preserve">تشخيص انتقال المعرفة بين إدارة المرافق والمصممين في المملكة، ومعوقات التعلم مزدوج الحلقة.</w:t>
       </w:r>
     </w:p>
     <w:p>
@@ -372,7 +372,7 @@
           <w:color w:val="000000"/>
           <w:rtl/>
         </w:rPr>
-        <w:t xml:space="preserve">تطوير نموذج التغذية الراجعة بمكوناته: العمليات والأدوار والأدوات والتوقيت.</w:t>
+        <w:t xml:space="preserve">بناء مصفوفة تربط المشكلات التشغيلية المتكررة بافتراضات التصميم وقراراته.</w:t>
       </w:r>
     </w:p>
     <w:p>
@@ -395,7 +395,7 @@
           <w:color w:val="000000"/>
           <w:rtl/>
         </w:rPr>
-        <w:t xml:space="preserve">التحقق من صلاحية النموذج وقابليته للتطبيق عبر تحكيم الخبراء.</w:t>
+        <w:t xml:space="preserve">تطوير النموذج بعملياته وأدواره وتوقيته، والتحقق منه بتحكيم الخبراء.</w:t>
       </w:r>
     </w:p>
     <w:sectPr>

</xml_diff>

<commit_message>
Keep the epistemic framing but drop the explicit philosopher name
Co-Authored-By: Claude Opus 5.5 <noreply@anthropic.com>
Claude-Session: https://claude.ai/code/session_01Nx6foxEiSvCdRQd3zZ6Gj4
</commit_message>
<xml_diff>
--- a/research-proposal-summary.docx
+++ b/research-proposal-summary.docx
@@ -65,7 +65,7 @@
           <w:color w:val="000000"/>
           <w:rtl/>
         </w:rPr>
-        <w:t xml:space="preserve">تصمم المباني على افتراضات عن المستخدمين وأنماط الاستخدام والظروف الداخلية، وتجمع إدارة المرافق بعد الإشغال بيانات تثبتها أو تنقضها، كالبلاغات واستهلاك الطاقة، لكنها لا تعود إلى المصممين بشكل منهجي، فتتكرر الأخطاء في المشاريع اللاحقة والنماذج المتكررة. والمشكلة في عمقها معرفية: فالمعرفة عند بوبر تنمو بالتخمين ومحاولة الدحض، وقرار التصميم تخمين والإشغال اختباره، فإذا لم تعد نتائجه إلى المصمم بقي تخمينه بلا اختبار، وغابت عنه النواتج غير المقصودة لقراراته.</w:t>
+        <w:t xml:space="preserve">تصمم المباني على افتراضات عن المستخدمين وأنماط الاستخدام والظروف الداخلية، وتجمع إدارة المرافق بعد الإشغال بيانات تثبتها أو تنقضها، كالبلاغات واستهلاك الطاقة، لكنها لا تعود إلى المصممين بشكل منهجي، فتتكرر الأخطاء في المشاريع اللاحقة والنماذج المتكررة. والمشكلة في عمقها معرفية: فقرار التصميم تخمين والإشغال اختباره، والمعرفة تنمو بالتخمين ومحاولة الدحض، فإذا لم تعد نتائج الإشغال إلى المصمم بقي تخمينه بلا اختبار، وغابت عنه النواتج غير المقصودة لقراراته.</w:t>
       </w:r>
     </w:p>
     <w:p>
@@ -303,7 +303,7 @@
           <w:color w:val="000000"/>
           <w:rtl/>
         </w:rPr>
-        <w:t xml:space="preserve">تأصيل قرار التصميم بوصفه فرضية قابلة للدحض، وبناء إطار نظري للتغذية الراجعة في ضوء فلسفة بوبر والتعلم مزدوج الحلقة.</w:t>
+        <w:t xml:space="preserve">تأصيل قرار التصميم بوصفه فرضية قابلة للدحض، وبناء إطار نظري للتغذية الراجعة في ضوء فلسفة العلم ونظرية التعلم مزدوج الحلقة.</w:t>
       </w:r>
     </w:p>
     <w:p>

</xml_diff>